<commit_message>
Report: condense to fit 15 pages — chapters flow continuously (drop per-chapter page breaks), trim Ch3
Co-Authored-By: Claude Opus 4.8 <noreply@anthropic.com>
</commit_message>
<xml_diff>
--- a/Group_10_Report.docx
+++ b/Group_10_Report.docx
@@ -1075,9 +1075,6 @@
       </w:r>
     </w:p>
     <w:p>
-      <w:br w:type="page"/>
-    </w:p>
-    <w:p>
       <w:pPr>
         <w:pStyle w:val="Heading1"/>
         <w:spacing w:before="200" w:after="80" w:lineRule="auto" w:line="276"/>
@@ -2602,9 +2599,6 @@
       </w:r>
     </w:p>
     <w:p>
-      <w:br w:type="page"/>
-    </w:p>
-    <w:p>
       <w:pPr>
         <w:pStyle w:val="Heading1"/>
         <w:spacing w:before="200" w:after="80" w:lineRule="auto" w:line="276"/>
@@ -3194,9 +3188,6 @@
       </w:tr>
     </w:tbl>
     <w:p/>
-    <w:p>
-      <w:br w:type="page"/>
-    </w:p>
     <w:p>
       <w:pPr>
         <w:pStyle w:val="Heading1"/>
@@ -4435,155 +4426,6 @@
       </w:tr>
     </w:tbl>
     <w:p/>
-    <w:p>
-      <w:pPr>
-        <w:spacing w:before="0" w:after="120" w:lineRule="auto" w:line="360"/>
-      </w:pPr>
-      <w:r>
-        <w:t xml:space="preserve">Variance gap is a measure of </w:t>
-      </w:r>
-      <w:r>
-        <w:rPr>
-          <w:i/>
-        </w:rPr>
-        <w:t>spread</w:t>
-      </w:r>
-      <w:r>
-        <w:t>, not of separation, and the rank-biserial effect sizes (</w:t>
-      </w:r>
-      <w:r>
-        <w:rPr>
-          <w:rFonts w:ascii="Courier New" w:hAnsi="Courier New"/>
-          <w:sz w:val="18"/>
-        </w:rPr>
-        <w:t>report/ch3_d1_feature_stats.csv</w:t>
-      </w:r>
-      <w:r>
-        <w:t xml:space="preserve">, and the same statistics in </w:t>
-      </w:r>
-      <w:r>
-        <w:rPr>
-          <w:rFonts w:ascii="Courier New" w:hAnsi="Courier New"/>
-          <w:sz w:val="18"/>
-        </w:rPr>
-        <w:t>report/ch3_feature_justification.csv</w:t>
-      </w:r>
-      <w:r>
-        <w:t xml:space="preserve">) reorder the table decisively. On Dataset 1, 41 of the 43 features separate the classes at p &lt; 0.05, but only six reach |r| ≥ 0.2: </w:t>
-      </w:r>
-      <w:r>
-        <w:rPr>
-          <w:rFonts w:ascii="Courier New" w:hAnsi="Courier New"/>
-          <w:sz w:val="18"/>
-        </w:rPr>
-        <w:t>n_abs_paths</w:t>
-      </w:r>
-      <w:r>
-        <w:t xml:space="preserve"> (+0.452), </w:t>
-      </w:r>
-      <w:r>
-        <w:rPr>
-          <w:rFonts w:ascii="Courier New" w:hAnsi="Courier New"/>
-          <w:sz w:val="18"/>
-        </w:rPr>
-        <w:t>special_ratio</w:t>
-      </w:r>
-      <w:r>
-        <w:t xml:space="preserve"> (+0.318), </w:t>
-      </w:r>
-      <w:r>
-        <w:rPr>
-          <w:rFonts w:ascii="Courier New" w:hAnsi="Courier New"/>
-          <w:sz w:val="18"/>
-        </w:rPr>
-        <w:t>max_token_len</w:t>
-      </w:r>
-      <w:r>
-        <w:t xml:space="preserve"> (+0.303), </w:t>
-      </w:r>
-      <w:r>
-        <w:rPr>
-          <w:rFonts w:ascii="Courier New" w:hAnsi="Courier New"/>
-          <w:sz w:val="18"/>
-        </w:rPr>
-        <w:t>len_chars</w:t>
-      </w:r>
-      <w:r>
-        <w:t xml:space="preserve"> (+0.247), </w:t>
-      </w:r>
-      <w:r>
-        <w:rPr>
-          <w:rFonts w:ascii="Courier New" w:hAnsi="Courier New"/>
-          <w:sz w:val="18"/>
-        </w:rPr>
-        <w:t>digit_ratio</w:t>
-      </w:r>
-      <w:r>
-        <w:t xml:space="preserve"> (+0.238), and </w:t>
-      </w:r>
-      <w:r>
-        <w:rPr>
-          <w:rFonts w:ascii="Courier New" w:hAnsi="Courier New"/>
-          <w:sz w:val="18"/>
-        </w:rPr>
-        <w:t>n_redirect_out</w:t>
-      </w:r>
-      <w:r>
-        <w:t xml:space="preserve"> (+0.229). The two that fail the significance test are </w:t>
-      </w:r>
-      <w:r>
-        <w:rPr>
-          <w:rFonts w:ascii="Courier New" w:hAnsi="Courier New"/>
-          <w:sz w:val="18"/>
-        </w:rPr>
-        <w:t>has_long_flag</w:t>
-      </w:r>
-      <w:r>
-        <w:t xml:space="preserve"> (p = 0.081) and </w:t>
-      </w:r>
-      <w:r>
-        <w:rPr>
-          <w:rFonts w:ascii="Courier New" w:hAnsi="Courier New"/>
-          <w:sz w:val="18"/>
-        </w:rPr>
-        <w:t>has_private_ip</w:t>
-      </w:r>
-      <w:r>
-        <w:t xml:space="preserve">, which is essentially inert here (r ≈ 0, prevalence 0.0007 in both classes) and earns its place in the feature set on Dataset 2 rather than this one. Note the crossings: </w:t>
-      </w:r>
-      <w:r>
-        <w:rPr>
-          <w:rFonts w:ascii="Courier New" w:hAnsi="Courier New"/>
-          <w:sz w:val="18"/>
-        </w:rPr>
-        <w:t>n_abs_paths</w:t>
-      </w:r>
-      <w:r>
-        <w:t xml:space="preserve"> ranks eighth by variance gap and </w:t>
-      </w:r>
-      <w:r>
-        <w:rPr>
-          <w:i/>
-        </w:rPr>
-        <w:t>first</w:t>
-      </w:r>
-      <w:r>
-        <w:t xml:space="preserve"> by effect, while </w:t>
-      </w:r>
-      <w:r>
-        <w:rPr>
-          <w:rFonts w:ascii="Courier New" w:hAnsi="Courier New"/>
-          <w:sz w:val="18"/>
-        </w:rPr>
-        <w:t>len_chars</w:t>
-      </w:r>
-      <w:r>
-        <w:t xml:space="preserve"> leads the gap table and places only fourth by effect — spread and signal are not the same quantity, which is the theme of the takeaways below.</w:t>
-      </w:r>
-    </w:p>
-    <w:p>
-      <w:br w:type="page"/>
-    </w:p>
     <w:p>
       <w:pPr>
         <w:pStyle w:val="Heading1"/>
@@ -5520,9 +5362,6 @@
       </w:r>
     </w:p>
     <w:p>
-      <w:br w:type="page"/>
-    </w:p>
-    <w:p>
       <w:pPr>
         <w:pStyle w:val="Heading1"/>
         <w:spacing w:before="200" w:after="80" w:lineRule="auto" w:line="276"/>
@@ -6367,9 +6206,6 @@
       </w:r>
     </w:p>
     <w:p>
-      <w:br w:type="page"/>
-    </w:p>
-    <w:p>
       <w:pPr>
         <w:pStyle w:val="Heading1"/>
         <w:spacing w:before="200" w:after="80" w:lineRule="auto" w:line="276"/>
@@ -6928,9 +6764,6 @@
       <w:r>
         <w:t>, NeurIPS 2015, motivating the character granularity).</w:t>
       </w:r>
-    </w:p>
-    <w:p>
-      <w:br w:type="page"/>
     </w:p>
     <w:p>
       <w:pPr>
@@ -7224,9 +7057,6 @@
       </w:r>
     </w:p>
     <w:p>
-      <w:br w:type="page"/>
-    </w:p>
-    <w:p>
       <w:pPr>
         <w:pStyle w:val="Heading1"/>
         <w:spacing w:before="200" w:after="80" w:lineRule="auto" w:line="276"/>
@@ -14252,9 +14082,6 @@
       <w:r>
         <w:t>The cascade's one apparent win is precision: 0.9083 against the hybrid's 0.8755 on Dataset 1, with the false-alarm rate falling from 4.15% to 2.80%. That is a 33% relative reduction in analyst workload from false positives, and it is the number a charitable write-up would lead with. The rest of this chapter is the argument for why it should not.</w:t>
       </w:r>
-    </w:p>
-    <w:p>
-      <w:br w:type="page"/>
     </w:p>
     <w:p>
       <w:pPr>

</xml_diff>